<commit_message>
Lab 4 was performes DFS and BFS
</commit_message>
<xml_diff>
--- a/Lab 2/Lab 2 - Jornal .docx
+++ b/Lab 2/Lab 2 - Jornal .docx
@@ -218,7 +218,7 @@
                                 <w:sz w:val="36"/>
                                 <w:szCs w:val="36"/>
                               </w:rPr>
-                              <w:t>1</w:t>
+                              <w:t>2</w:t>
                             </w:r>
                           </w:p>
                           <w:p>
@@ -256,7 +256,7 @@
                                 <w:sz w:val="28"/>
                                 <w:szCs w:val="28"/>
                               </w:rPr>
-                              <w:t>1</w:t>
+                              <w:t>2</w:t>
                             </w:r>
                             <w:r>
                               <w:rPr>
@@ -274,7 +274,7 @@
                                 <w:sz w:val="28"/>
                                 <w:szCs w:val="28"/>
                               </w:rPr>
-                              <w:t>30</w:t>
+                              <w:t>13</w:t>
                             </w:r>
                             <w:r>
                               <w:rPr>
@@ -378,7 +378,7 @@
                           <w:sz w:val="36"/>
                           <w:szCs w:val="36"/>
                         </w:rPr>
-                        <w:t>1</w:t>
+                        <w:t>2</w:t>
                       </w:r>
                     </w:p>
                     <w:p>
@@ -416,7 +416,7 @@
                           <w:sz w:val="28"/>
                           <w:szCs w:val="28"/>
                         </w:rPr>
-                        <w:t>1</w:t>
+                        <w:t>2</w:t>
                       </w:r>
                       <w:r>
                         <w:rPr>
@@ -434,7 +434,7 @@
                           <w:sz w:val="28"/>
                           <w:szCs w:val="28"/>
                         </w:rPr>
-                        <w:t>30</w:t>
+                        <w:t>13</w:t>
                       </w:r>
                       <w:r>
                         <w:rPr>
@@ -2836,7 +2836,7 @@
           <w:szCs w:val="40"/>
         </w:rPr>
         <w:lastRenderedPageBreak/>
-        <w:t>Python Installation and basic code</w:t>
+        <w:t>Python Basic Syntax</w:t>
       </w:r>
     </w:p>
     <w:p>
@@ -2846,46 +2846,6 @@
           <w:color w:val="000000" w:themeColor="text1"/>
         </w:rPr>
       </w:pPr>
-    </w:p>
-    <w:p>
-      <w:pPr>
-        <w:pStyle w:val="Heading2"/>
-        <w:rPr>
-          <w:color w:val="000000" w:themeColor="text1"/>
-        </w:rPr>
-      </w:pPr>
-      <w:r>
-        <w:rPr>
-          <w:color w:val="000000" w:themeColor="text1"/>
-          <w:highlight w:val="yellow"/>
-        </w:rPr>
-        <w:t>Task 1:</w:t>
-      </w:r>
-      <w:r>
-        <w:rPr>
-          <w:color w:val="000000" w:themeColor="text1"/>
-        </w:rPr>
-        <w:t xml:space="preserve"> Installing the python</w:t>
-      </w:r>
-    </w:p>
-    <w:p>
-      <w:pPr>
-        <w:rPr>
-          <w:b/>
-          <w:bCs/>
-          <w:sz w:val="24"/>
-          <w:szCs w:val="24"/>
-        </w:rPr>
-      </w:pPr>
-      <w:r>
-        <w:rPr>
-          <w:b/>
-          <w:bCs/>
-          <w:sz w:val="24"/>
-          <w:szCs w:val="24"/>
-        </w:rPr>
-        <w:t>Screenshot</w:t>
-      </w:r>
     </w:p>
     <w:p>
       <w:pPr>
@@ -2899,10 +2859,10 @@
           <w:noProof/>
         </w:rPr>
         <w:drawing>
-          <wp:inline distT="0" distB="0" distL="0" distR="0" wp14:anchorId="5B2DABF9" wp14:editId="022B4C26">
-            <wp:extent cx="3657600" cy="1390650"/>
-            <wp:effectExtent l="0" t="0" r="0" b="0"/>
-            <wp:docPr id="2012792512" name="Picture 1"/>
+          <wp:inline distT="0" distB="0" distL="0" distR="0" wp14:anchorId="449EE5BA" wp14:editId="45E0DC30">
+            <wp:extent cx="5733415" cy="800735"/>
+            <wp:effectExtent l="0" t="0" r="635" b="0"/>
+            <wp:docPr id="1385385238" name="Picture 1"/>
             <wp:cNvGraphicFramePr>
               <a:graphicFrameLocks xmlns:a="http://schemas.openxmlformats.org/drawingml/2006/main" noChangeAspect="1"/>
             </wp:cNvGraphicFramePr>
@@ -2910,7 +2870,7 @@
               <a:graphicData uri="http://schemas.openxmlformats.org/drawingml/2006/picture">
                 <pic:pic xmlns:pic="http://schemas.openxmlformats.org/drawingml/2006/picture">
                   <pic:nvPicPr>
-                    <pic:cNvPr id="2012792512" name=""/>
+                    <pic:cNvPr id="1385385238" name=""/>
                     <pic:cNvPicPr/>
                   </pic:nvPicPr>
                   <pic:blipFill>
@@ -2922,7 +2882,7 @@
                   <pic:spPr>
                     <a:xfrm>
                       <a:off x="0" y="0"/>
-                      <a:ext cx="3657600" cy="1390650"/>
+                      <a:ext cx="5733415" cy="800735"/>
                     </a:xfrm>
                     <a:prstGeom prst="rect">
                       <a:avLst/>
@@ -2938,66 +2898,23 @@
     <w:p>
       <w:pPr>
         <w:rPr>
-          <w:sz w:val="24"/>
-          <w:szCs w:val="24"/>
+          <w:sz w:val="28"/>
+          <w:szCs w:val="28"/>
         </w:rPr>
       </w:pPr>
       <w:r>
         <w:rPr>
           <w:b/>
           <w:bCs/>
-          <w:sz w:val="24"/>
-          <w:szCs w:val="24"/>
-          <w:highlight w:val="yellow"/>
-        </w:rPr>
-        <w:t>Task 2:</w:t>
-      </w:r>
-      <w:r>
-        <w:rPr>
-          <w:b/>
-          <w:bCs/>
-          <w:sz w:val="24"/>
-          <w:szCs w:val="24"/>
-        </w:rPr>
-        <w:t xml:space="preserve"> Make a Simple Grade Calculator in Python</w:t>
-      </w:r>
-      <w:r>
-        <w:rPr>
-          <w:sz w:val="24"/>
-          <w:szCs w:val="24"/>
-        </w:rPr>
-        <w:t xml:space="preserve"> </w:t>
-      </w:r>
-    </w:p>
-    <w:p>
-      <w:pPr>
-        <w:rPr>
-          <w:b/>
-          <w:bCs/>
-          <w:sz w:val="24"/>
-          <w:szCs w:val="24"/>
-        </w:rPr>
-      </w:pPr>
-      <w:r>
-        <w:rPr>
-          <w:sz w:val="24"/>
-          <w:szCs w:val="24"/>
-        </w:rPr>
-        <w:br/>
-      </w:r>
-      <w:r>
-        <w:rPr>
-          <w:b/>
-          <w:bCs/>
-          <w:sz w:val="24"/>
-          <w:szCs w:val="24"/>
+          <w:sz w:val="28"/>
+          <w:szCs w:val="28"/>
         </w:rPr>
         <w:t>Code:</w:t>
       </w:r>
       <w:r>
         <w:rPr>
-          <w:sz w:val="24"/>
-          <w:szCs w:val="24"/>
+          <w:sz w:val="28"/>
+          <w:szCs w:val="28"/>
         </w:rPr>
         <w:t xml:space="preserve"> </w:t>
       </w:r>
@@ -3005,14 +2922,46 @@
         <w:r>
           <w:rPr>
             <w:rStyle w:val="Hyperlink"/>
-            <w:b/>
-            <w:bCs/>
-            <w:sz w:val="24"/>
-            <w:szCs w:val="24"/>
+            <w:sz w:val="28"/>
+            <w:szCs w:val="28"/>
           </w:rPr>
-          <w:t>GitHub Link</w:t>
+          <w:t>Task 1 Code</w:t>
         </w:r>
+        <w:r>
+          <w:rPr>
+            <w:rStyle w:val="Hyperlink"/>
+            <w:sz w:val="28"/>
+            <w:szCs w:val="28"/>
+          </w:rPr>
+          <w:t xml:space="preserve"> </w:t>
+        </w:r>
+        <w:r>
+          <w:rPr>
+            <w:rStyle w:val="Hyperlink"/>
+            <w:sz w:val="28"/>
+            <w:szCs w:val="28"/>
+          </w:rPr>
+          <w:t xml:space="preserve">in </w:t>
+        </w:r>
+        <w:proofErr w:type="spellStart"/>
+        <w:r>
+          <w:rPr>
+            <w:rStyle w:val="Hyperlink"/>
+            <w:sz w:val="28"/>
+            <w:szCs w:val="28"/>
+          </w:rPr>
+          <w:t>Github</w:t>
+        </w:r>
+        <w:proofErr w:type="spellEnd"/>
       </w:hyperlink>
+    </w:p>
+    <w:p>
+      <w:pPr>
+        <w:rPr>
+          <w:sz w:val="24"/>
+          <w:szCs w:val="24"/>
+        </w:rPr>
+      </w:pPr>
     </w:p>
     <w:p>
       <w:pPr>
@@ -3036,8 +2985,6 @@
     <w:p>
       <w:pPr>
         <w:rPr>
-          <w:b/>
-          <w:bCs/>
           <w:sz w:val="24"/>
           <w:szCs w:val="24"/>
         </w:rPr>
@@ -3047,10 +2994,10 @@
           <w:noProof/>
         </w:rPr>
         <w:drawing>
-          <wp:inline distT="0" distB="0" distL="0" distR="0" wp14:anchorId="766718E7" wp14:editId="010C3E93">
-            <wp:extent cx="5733415" cy="2625725"/>
-            <wp:effectExtent l="0" t="0" r="635" b="3175"/>
-            <wp:docPr id="822611671" name="Picture 1"/>
+          <wp:inline distT="0" distB="0" distL="0" distR="0" wp14:anchorId="47878CB5" wp14:editId="6B94B6DA">
+            <wp:extent cx="5733415" cy="697230"/>
+            <wp:effectExtent l="0" t="0" r="635" b="7620"/>
+            <wp:docPr id="1337104995" name="Picture 1"/>
             <wp:cNvGraphicFramePr>
               <a:graphicFrameLocks xmlns:a="http://schemas.openxmlformats.org/drawingml/2006/main" noChangeAspect="1"/>
             </wp:cNvGraphicFramePr>
@@ -3058,7 +3005,7 @@
               <a:graphicData uri="http://schemas.openxmlformats.org/drawingml/2006/picture">
                 <pic:pic xmlns:pic="http://schemas.openxmlformats.org/drawingml/2006/picture">
                   <pic:nvPicPr>
-                    <pic:cNvPr id="822611671" name=""/>
+                    <pic:cNvPr id="1337104995" name=""/>
                     <pic:cNvPicPr/>
                   </pic:nvPicPr>
                   <pic:blipFill>
@@ -3070,7 +3017,7 @@
                   <pic:spPr>
                     <a:xfrm>
                       <a:off x="0" y="0"/>
-                      <a:ext cx="5733415" cy="2625725"/>
+                      <a:ext cx="5733415" cy="697230"/>
                     </a:xfrm>
                     <a:prstGeom prst="rect">
                       <a:avLst/>
@@ -3085,6 +3032,240 @@
     </w:p>
     <w:p>
       <w:pPr>
+        <w:rPr>
+          <w:sz w:val="24"/>
+          <w:szCs w:val="24"/>
+        </w:rPr>
+      </w:pPr>
+    </w:p>
+    <w:p>
+      <w:pPr>
+        <w:pBdr>
+          <w:top w:val="single" w:sz="6" w:space="1" w:color="auto"/>
+          <w:bottom w:val="single" w:sz="6" w:space="1" w:color="auto"/>
+        </w:pBdr>
+        <w:rPr>
+          <w:sz w:val="24"/>
+          <w:szCs w:val="24"/>
+        </w:rPr>
+      </w:pPr>
+    </w:p>
+    <w:p>
+      <w:pPr>
+        <w:rPr>
+          <w:sz w:val="24"/>
+          <w:szCs w:val="24"/>
+        </w:rPr>
+      </w:pPr>
+    </w:p>
+    <w:p>
+      <w:pPr>
+        <w:rPr>
+          <w:sz w:val="24"/>
+          <w:szCs w:val="24"/>
+        </w:rPr>
+      </w:pPr>
+    </w:p>
+    <w:p>
+      <w:pPr>
+        <w:rPr>
+          <w:b/>
+          <w:bCs/>
+          <w:sz w:val="24"/>
+          <w:szCs w:val="24"/>
+        </w:rPr>
+      </w:pPr>
+      <w:r>
+        <w:rPr>
+          <w:noProof/>
+        </w:rPr>
+        <w:drawing>
+          <wp:inline distT="0" distB="0" distL="0" distR="0" wp14:anchorId="768F0BAE" wp14:editId="68C01316">
+            <wp:extent cx="3819525" cy="1905000"/>
+            <wp:effectExtent l="0" t="0" r="9525" b="0"/>
+            <wp:docPr id="1445791928" name="Picture 1"/>
+            <wp:cNvGraphicFramePr>
+              <a:graphicFrameLocks xmlns:a="http://schemas.openxmlformats.org/drawingml/2006/main" noChangeAspect="1"/>
+            </wp:cNvGraphicFramePr>
+            <a:graphic xmlns:a="http://schemas.openxmlformats.org/drawingml/2006/main">
+              <a:graphicData uri="http://schemas.openxmlformats.org/drawingml/2006/picture">
+                <pic:pic xmlns:pic="http://schemas.openxmlformats.org/drawingml/2006/picture">
+                  <pic:nvPicPr>
+                    <pic:cNvPr id="1445791928" name=""/>
+                    <pic:cNvPicPr/>
+                  </pic:nvPicPr>
+                  <pic:blipFill>
+                    <a:blip r:embed="rId14"/>
+                    <a:stretch>
+                      <a:fillRect/>
+                    </a:stretch>
+                  </pic:blipFill>
+                  <pic:spPr>
+                    <a:xfrm>
+                      <a:off x="0" y="0"/>
+                      <a:ext cx="3819525" cy="1905000"/>
+                    </a:xfrm>
+                    <a:prstGeom prst="rect">
+                      <a:avLst/>
+                    </a:prstGeom>
+                  </pic:spPr>
+                </pic:pic>
+              </a:graphicData>
+            </a:graphic>
+          </wp:inline>
+        </w:drawing>
+      </w:r>
+      <w:r>
+        <w:rPr>
+          <w:sz w:val="24"/>
+          <w:szCs w:val="24"/>
+        </w:rPr>
+        <w:br/>
+      </w:r>
+    </w:p>
+    <w:p>
+      <w:pPr>
+        <w:rPr>
+          <w:b/>
+          <w:bCs/>
+          <w:sz w:val="32"/>
+          <w:szCs w:val="32"/>
+        </w:rPr>
+      </w:pPr>
+      <w:r>
+        <w:rPr>
+          <w:b/>
+          <w:bCs/>
+          <w:sz w:val="32"/>
+          <w:szCs w:val="32"/>
+        </w:rPr>
+        <w:t>Code:</w:t>
+      </w:r>
+      <w:r>
+        <w:rPr>
+          <w:sz w:val="32"/>
+          <w:szCs w:val="32"/>
+        </w:rPr>
+        <w:t xml:space="preserve"> </w:t>
+      </w:r>
+      <w:hyperlink r:id="rId15" w:history="1">
+        <w:r>
+          <w:rPr>
+            <w:rStyle w:val="Hyperlink"/>
+            <w:sz w:val="28"/>
+            <w:szCs w:val="28"/>
+          </w:rPr>
+          <w:t xml:space="preserve">Task 2 </w:t>
+        </w:r>
+        <w:r>
+          <w:rPr>
+            <w:rStyle w:val="Hyperlink"/>
+            <w:sz w:val="28"/>
+            <w:szCs w:val="28"/>
+          </w:rPr>
+          <w:t>C</w:t>
+        </w:r>
+        <w:r>
+          <w:rPr>
+            <w:rStyle w:val="Hyperlink"/>
+            <w:sz w:val="28"/>
+            <w:szCs w:val="28"/>
+          </w:rPr>
+          <w:t xml:space="preserve">ode in </w:t>
+        </w:r>
+        <w:proofErr w:type="spellStart"/>
+        <w:r>
+          <w:rPr>
+            <w:rStyle w:val="Hyperlink"/>
+            <w:sz w:val="28"/>
+            <w:szCs w:val="28"/>
+          </w:rPr>
+          <w:t>Github</w:t>
+        </w:r>
+        <w:proofErr w:type="spellEnd"/>
+      </w:hyperlink>
+    </w:p>
+    <w:p>
+      <w:pPr>
+        <w:rPr>
+          <w:b/>
+          <w:bCs/>
+          <w:sz w:val="24"/>
+          <w:szCs w:val="24"/>
+        </w:rPr>
+      </w:pPr>
+      <w:r>
+        <w:rPr>
+          <w:b/>
+          <w:bCs/>
+          <w:sz w:val="24"/>
+          <w:szCs w:val="24"/>
+        </w:rPr>
+        <w:t>Screenshot</w:t>
+      </w:r>
+    </w:p>
+    <w:p>
+      <w:pPr>
+        <w:rPr>
+          <w:b/>
+          <w:bCs/>
+          <w:sz w:val="24"/>
+          <w:szCs w:val="24"/>
+        </w:rPr>
+      </w:pPr>
+      <w:r>
+        <w:rPr>
+          <w:noProof/>
+        </w:rPr>
+        <w:drawing>
+          <wp:inline distT="0" distB="0" distL="0" distR="0" wp14:anchorId="3536B75D" wp14:editId="4E88793D">
+            <wp:extent cx="5733415" cy="644525"/>
+            <wp:effectExtent l="0" t="0" r="635" b="3175"/>
+            <wp:docPr id="2075040264" name="Picture 1"/>
+            <wp:cNvGraphicFramePr>
+              <a:graphicFrameLocks xmlns:a="http://schemas.openxmlformats.org/drawingml/2006/main" noChangeAspect="1"/>
+            </wp:cNvGraphicFramePr>
+            <a:graphic xmlns:a="http://schemas.openxmlformats.org/drawingml/2006/main">
+              <a:graphicData uri="http://schemas.openxmlformats.org/drawingml/2006/picture">
+                <pic:pic xmlns:pic="http://schemas.openxmlformats.org/drawingml/2006/picture">
+                  <pic:nvPicPr>
+                    <pic:cNvPr id="2075040264" name=""/>
+                    <pic:cNvPicPr/>
+                  </pic:nvPicPr>
+                  <pic:blipFill>
+                    <a:blip r:embed="rId16"/>
+                    <a:stretch>
+                      <a:fillRect/>
+                    </a:stretch>
+                  </pic:blipFill>
+                  <pic:spPr>
+                    <a:xfrm>
+                      <a:off x="0" y="0"/>
+                      <a:ext cx="5733415" cy="644525"/>
+                    </a:xfrm>
+                    <a:prstGeom prst="rect">
+                      <a:avLst/>
+                    </a:prstGeom>
+                  </pic:spPr>
+                </pic:pic>
+              </a:graphicData>
+            </a:graphic>
+          </wp:inline>
+        </w:drawing>
+      </w:r>
+    </w:p>
+    <w:p>
+      <w:pPr>
+        <w:rPr>
+          <w:b/>
+          <w:bCs/>
+          <w:sz w:val="24"/>
+          <w:szCs w:val="24"/>
+        </w:rPr>
+      </w:pPr>
+    </w:p>
+    <w:p>
+      <w:pPr>
         <w:spacing w:after="0"/>
         <w:jc w:val="both"/>
         <w:rPr>
@@ -3096,8 +3277,8 @@
       </w:pPr>
     </w:p>
     <w:sectPr>
-      <w:headerReference w:type="default" r:id="rId14"/>
-      <w:footerReference w:type="default" r:id="rId15"/>
+      <w:headerReference w:type="default" r:id="rId17"/>
+      <w:footerReference w:type="default" r:id="rId18"/>
       <w:pgSz w:w="11909" w:h="16834" w:code="9"/>
       <w:pgMar w:top="1440" w:right="1440" w:bottom="1440" w:left="1440" w:header="720" w:footer="720" w:gutter="0"/>
       <w:cols w:space="720"/>
@@ -3314,7 +3495,7 @@
         <w:sz w:val="20"/>
         <w:szCs w:val="20"/>
       </w:rPr>
-      <w:t>1</w:t>
+      <w:t>2</w:t>
     </w:r>
     <w:r>
       <w:rPr>
@@ -6263,6 +6444,7 @@
   <w:style w:type="character" w:default="1" w:styleId="DefaultParagraphFont">
     <w:name w:val="Default Paragraph Font"/>
     <w:uiPriority w:val="1"/>
+    <w:semiHidden/>
     <w:unhideWhenUsed/>
   </w:style>
   <w:style w:type="table" w:default="1" w:styleId="TableNormal">
@@ -6486,6 +6668,18 @@
     <w:rPr>
       <w:color w:val="605E5C"/>
       <w:shd w:val="clear" w:color="auto" w:fill="E1DFDD"/>
+    </w:rPr>
+  </w:style>
+  <w:style w:type="character" w:styleId="FollowedHyperlink">
+    <w:name w:val="FollowedHyperlink"/>
+    <w:basedOn w:val="DefaultParagraphFont"/>
+    <w:uiPriority w:val="99"/>
+    <w:semiHidden/>
+    <w:unhideWhenUsed/>
+    <w:rsid w:val="0086679C"/>
+    <w:rPr>
+      <w:color w:val="954F72" w:themeColor="followedHyperlink"/>
+      <w:u w:val="single"/>
     </w:rPr>
   </w:style>
 </w:styles>

</xml_diff>